<commit_message>
Lab 2 report: fill in discipline and teacher on title page
Discipline: Организация ЭВМ и систем, teacher: А.Ю. Попов (PDF and DOCX).

Co-Authored-By: Claude Opus 5.5 <noreply@anthropic.com>
Claude-Session: https://claude.ai/code/session_01HNvpwqb1fXZYmvEKNUX92g
</commit_message>
<xml_diff>
--- a/verification_lab2/Отчет_ЛР2_верификация_mant_shifter_вариант14.docx
+++ b/verification_lab2/Отчет_ЛР2_верификация_mant_shifter_вариант14.docx
@@ -433,7 +433,7 @@
           <w:sz w:val="24"/>
           <w:szCs w:val="24"/>
         </w:rPr>
-        <w:t xml:space="preserve">______________________________</w:t>
+        <w:t xml:space="preserve">Организация ЭВМ и систем</w:t>
       </w:r>
     </w:p>
     <w:p>
@@ -737,7 +737,7 @@
                 <w:sz w:val="24"/>
                 <w:szCs w:val="24"/>
               </w:rPr>
-              <w:t xml:space="preserve"/>
+              <w:t xml:space="preserve">А.Ю. Попов</w:t>
             </w:r>
           </w:p>
         </w:tc>

</xml_diff>